<commit_message>
chore: update 3-modelo-anexos.docx with revised footer
Manual edit to the DOCX export template — footer updated by user.

https://claude.ai/code/session_019xyjke4qrSb2nWYRPS1bYF
</commit_message>
<xml_diff>
--- a/backend/templates/3-modelo-anexos.docx
+++ b/backend/templates/3-modelo-anexos.docx
@@ -388,8 +388,6 @@
         <w:pStyle w:val="Corpodetexto"/>
         <w:ind w:left="2" w:right="562"/>
       </w:pPr>
-      <w:bookmarkStart w:id="0" w:name="_GoBack"/>
-      <w:bookmarkEnd w:id="0"/>
     </w:p>
     <w:p>
       <w:pPr>
@@ -587,468 +585,12 @@
         <w:pStyle w:val="Ttulo"/>
         <w:ind w:right="127"/>
       </w:pPr>
-      <w:r>
-        <w:rPr>
-          <w:noProof/>
-          <w:lang w:val="pt-BR" w:eastAsia="pt-BR"/>
-        </w:rPr>
-        <mc:AlternateContent>
-          <mc:Choice Requires="wpg">
-            <w:drawing>
-              <wp:anchor distT="0" distB="0" distL="0" distR="0" simplePos="0" relativeHeight="251663872" behindDoc="0" locked="0" layoutInCell="1" allowOverlap="1" wp14:anchorId="4FFE81B8" wp14:editId="4BB5A128">
-                <wp:simplePos x="0" y="0"/>
-                <wp:positionH relativeFrom="page">
-                  <wp:posOffset>-635</wp:posOffset>
-                </wp:positionH>
-                <wp:positionV relativeFrom="page">
-                  <wp:posOffset>9862185</wp:posOffset>
-                </wp:positionV>
-                <wp:extent cx="7556500" cy="825500"/>
-                <wp:effectExtent l="0" t="0" r="6350" b="0"/>
-                <wp:wrapNone/>
-                <wp:docPr id="10" name="Group 3"/>
-                <wp:cNvGraphicFramePr>
-                  <a:graphicFrameLocks xmlns:a="http://schemas.openxmlformats.org/drawingml/2006/main"/>
-                </wp:cNvGraphicFramePr>
-                <a:graphic xmlns:a="http://schemas.openxmlformats.org/drawingml/2006/main">
-                  <a:graphicData uri="http://schemas.microsoft.com/office/word/2010/wordprocessingGroup">
-                    <wpg:wgp>
-                      <wpg:cNvGrpSpPr>
-                        <a:grpSpLocks/>
-                      </wpg:cNvGrpSpPr>
-                      <wpg:grpSpPr>
-                        <a:xfrm>
-                          <a:off x="0" y="0"/>
-                          <a:ext cx="7556500" cy="825500"/>
-                          <a:chOff x="0" y="0"/>
-                          <a:chExt cx="7556500" cy="825500"/>
-                        </a:xfrm>
-                      </wpg:grpSpPr>
-                      <wps:wsp>
-                        <wps:cNvPr id="11" name="Graphic 4"/>
-                        <wps:cNvSpPr/>
-                        <wps:spPr>
-                          <a:xfrm>
-                            <a:off x="0" y="113664"/>
-                            <a:ext cx="7556500" cy="711835"/>
-                          </a:xfrm>
-                          <a:custGeom>
-                            <a:avLst/>
-                            <a:gdLst/>
-                            <a:ahLst/>
-                            <a:cxnLst/>
-                            <a:rect l="l" t="t" r="r" b="b"/>
-                            <a:pathLst>
-                              <a:path w="7556500" h="711835">
-                                <a:moveTo>
-                                  <a:pt x="7555992" y="0"/>
-                                </a:moveTo>
-                                <a:lnTo>
-                                  <a:pt x="0" y="0"/>
-                                </a:lnTo>
-                                <a:lnTo>
-                                  <a:pt x="0" y="711669"/>
-                                </a:lnTo>
-                                <a:lnTo>
-                                  <a:pt x="7555992" y="711669"/>
-                                </a:lnTo>
-                                <a:lnTo>
-                                  <a:pt x="7555992" y="0"/>
-                                </a:lnTo>
-                                <a:close/>
-                              </a:path>
-                            </a:pathLst>
-                          </a:custGeom>
-                          <a:solidFill>
-                            <a:srgbClr val="22375D"/>
-                          </a:solidFill>
-                        </wps:spPr>
-                        <wps:bodyPr wrap="square" lIns="0" tIns="0" rIns="0" bIns="0" rtlCol="0">
-                          <a:prstTxWarp prst="textNoShape">
-                            <a:avLst/>
-                          </a:prstTxWarp>
-                          <a:noAutofit/>
-                        </wps:bodyPr>
-                      </wps:wsp>
-                      <wps:wsp>
-                        <wps:cNvPr id="13" name="Graphic 5"/>
-                        <wps:cNvSpPr/>
-                        <wps:spPr>
-                          <a:xfrm>
-                            <a:off x="0" y="107950"/>
-                            <a:ext cx="7556500" cy="12065"/>
-                          </a:xfrm>
-                          <a:custGeom>
-                            <a:avLst/>
-                            <a:gdLst/>
-                            <a:ahLst/>
-                            <a:cxnLst/>
-                            <a:rect l="l" t="t" r="r" b="b"/>
-                            <a:pathLst>
-                              <a:path w="7556500" h="12065">
-                                <a:moveTo>
-                                  <a:pt x="0" y="12064"/>
-                                </a:moveTo>
-                                <a:lnTo>
-                                  <a:pt x="7555992" y="12064"/>
-                                </a:lnTo>
-                                <a:lnTo>
-                                  <a:pt x="7555992" y="0"/>
-                                </a:lnTo>
-                                <a:lnTo>
-                                  <a:pt x="0" y="0"/>
-                                </a:lnTo>
-                                <a:lnTo>
-                                  <a:pt x="0" y="12064"/>
-                                </a:lnTo>
-                                <a:close/>
-                              </a:path>
-                            </a:pathLst>
-                          </a:custGeom>
-                          <a:solidFill>
-                            <a:srgbClr val="41709C"/>
-                          </a:solidFill>
-                        </wps:spPr>
-                        <wps:bodyPr wrap="square" lIns="0" tIns="0" rIns="0" bIns="0" rtlCol="0">
-                          <a:prstTxWarp prst="textNoShape">
-                            <a:avLst/>
-                          </a:prstTxWarp>
-                          <a:noAutofit/>
-                        </wps:bodyPr>
-                      </wps:wsp>
-                      <wps:wsp>
-                        <wps:cNvPr id="14" name="Graphic 6"/>
-                        <wps:cNvSpPr/>
-                        <wps:spPr>
-                          <a:xfrm>
-                            <a:off x="0" y="0"/>
-                            <a:ext cx="7556500" cy="107950"/>
-                          </a:xfrm>
-                          <a:custGeom>
-                            <a:avLst/>
-                            <a:gdLst/>
-                            <a:ahLst/>
-                            <a:cxnLst/>
-                            <a:rect l="l" t="t" r="r" b="b"/>
-                            <a:pathLst>
-                              <a:path w="7556500" h="107950">
-                                <a:moveTo>
-                                  <a:pt x="0" y="0"/>
-                                </a:moveTo>
-                                <a:lnTo>
-                                  <a:pt x="0" y="107949"/>
-                                </a:lnTo>
-                                <a:lnTo>
-                                  <a:pt x="7555992" y="107949"/>
-                                </a:lnTo>
-                                <a:lnTo>
-                                  <a:pt x="7555992" y="0"/>
-                                </a:lnTo>
-                                <a:lnTo>
-                                  <a:pt x="0" y="0"/>
-                                </a:lnTo>
-                                <a:close/>
-                              </a:path>
-                            </a:pathLst>
-                          </a:custGeom>
-                          <a:solidFill>
-                            <a:srgbClr val="F1F1F1"/>
-                          </a:solidFill>
-                        </wps:spPr>
-                        <wps:bodyPr wrap="square" lIns="0" tIns="0" rIns="0" bIns="0" rtlCol="0">
-                          <a:prstTxWarp prst="textNoShape">
-                            <a:avLst/>
-                          </a:prstTxWarp>
-                          <a:noAutofit/>
-                        </wps:bodyPr>
-                      </wps:wsp>
-                      <wps:wsp>
-                        <wps:cNvPr id="15" name="Textbox 7"/>
-                        <wps:cNvSpPr txBox="1"/>
-                        <wps:spPr>
-                          <a:xfrm>
-                            <a:off x="257556" y="501865"/>
-                            <a:ext cx="389890" cy="127000"/>
-                          </a:xfrm>
-                          <a:prstGeom prst="rect">
-                            <a:avLst/>
-                          </a:prstGeom>
-                        </wps:spPr>
-                        <wps:txbx>
-                          <w:txbxContent>
-                            <w:p>
-                              <w:pPr>
-                                <w:spacing w:line="199" w:lineRule="exact"/>
-                                <w:rPr>
-                                  <w:rFonts w:ascii="Calibri" w:hAnsi="Calibri"/>
-                                  <w:sz w:val="20"/>
-                                </w:rPr>
-                              </w:pPr>
-                              <w:r>
-                                <w:rPr>
-                                  <w:rFonts w:ascii="Calibri" w:hAnsi="Calibri"/>
-                                  <w:spacing w:val="-2"/>
-                                  <w:sz w:val="20"/>
-                                </w:rPr>
-                                <w:t>Público</w:t>
-                              </w:r>
-                            </w:p>
-                          </w:txbxContent>
-                        </wps:txbx>
-                        <wps:bodyPr wrap="square" lIns="0" tIns="0" rIns="0" bIns="0" rtlCol="0">
-                          <a:noAutofit/>
-                        </wps:bodyPr>
-                      </wps:wsp>
-                      <wps:wsp>
-                        <wps:cNvPr id="16" name="Textbox 8"/>
-                        <wps:cNvSpPr txBox="1"/>
-                        <wps:spPr>
-                          <a:xfrm>
-                            <a:off x="1938782" y="315937"/>
-                            <a:ext cx="3674745" cy="280670"/>
-                          </a:xfrm>
-                          <a:prstGeom prst="rect">
-                            <a:avLst/>
-                          </a:prstGeom>
-                        </wps:spPr>
-                        <wps:txbx>
-                          <w:txbxContent>
-                            <w:p>
-                              <w:pPr>
-                                <w:spacing w:line="239" w:lineRule="exact"/>
-                                <w:ind w:left="4" w:right="19"/>
-                                <w:jc w:val="center"/>
-                                <w:rPr>
-                                  <w:rFonts w:ascii="Calibri" w:hAnsi="Calibri"/>
-                                  <w:b/>
-                                  <w:sz w:val="20"/>
-                                </w:rPr>
-                              </w:pPr>
-                              <w:r>
-                                <w:rPr>
-                                  <w:rFonts w:ascii="Calibri" w:hAnsi="Calibri"/>
-                                  <w:color w:val="FFFFFF"/>
-                                  <w:sz w:val="20"/>
-                                </w:rPr>
-                                <w:t>Rodovia Engenheiro Ermênio de Oliveira Penteado, s/nº, Itaici, Indaiatuba - SP, 13340-600</w:t>
-                              </w:r>
-                              <w:r>
-                                <w:rPr>
-                                  <w:rFonts w:ascii="Calibri" w:hAnsi="Calibri"/>
-                                  <w:color w:val="FFFFFF"/>
-                                  <w:sz w:val="20"/>
-                                </w:rPr>
-                                <w:t xml:space="preserve"> - Página</w:t>
-                              </w:r>
-                              <w:r>
-                                <w:rPr>
-                                  <w:rFonts w:ascii="Calibri" w:hAnsi="Calibri"/>
-                                  <w:color w:val="FFFFFF"/>
-                                  <w:spacing w:val="-1"/>
-                                  <w:sz w:val="20"/>
-                                </w:rPr>
-                                <w:t xml:space="preserve"> </w:t>
-                              </w:r>
-                              <w:r>
-                                <w:rPr>
-                                  <w:rFonts w:ascii="Calibri" w:hAnsi="Calibri"/>
-                                  <w:b/>
-                                  <w:color w:val="FFFFFF"/>
-                                  <w:sz w:val="20"/>
-                                </w:rPr>
-                                <w:t>1</w:t>
-                              </w:r>
-                              <w:r>
-                                <w:rPr>
-                                  <w:rFonts w:ascii="Calibri" w:hAnsi="Calibri"/>
-                                  <w:b/>
-                                  <w:color w:val="FFFFFF"/>
-                                  <w:spacing w:val="-3"/>
-                                  <w:sz w:val="20"/>
-                                </w:rPr>
-                                <w:t xml:space="preserve"> </w:t>
-                              </w:r>
-                              <w:r>
-                                <w:rPr>
-                                  <w:rFonts w:ascii="Calibri" w:hAnsi="Calibri"/>
-                                  <w:color w:val="FFFFFF"/>
-                                  <w:sz w:val="20"/>
-                                </w:rPr>
-                                <w:t>de</w:t>
-                              </w:r>
-                              <w:r>
-                                <w:rPr>
-                                  <w:rFonts w:ascii="Calibri" w:hAnsi="Calibri"/>
-                                  <w:color w:val="FFFFFF"/>
-                                  <w:spacing w:val="-4"/>
-                                  <w:sz w:val="20"/>
-                                </w:rPr>
-                                <w:t xml:space="preserve"> </w:t>
-                              </w:r>
-                              <w:r>
-                                <w:rPr>
-                                  <w:rFonts w:ascii="Calibri" w:hAnsi="Calibri"/>
-                                  <w:b/>
-                                  <w:color w:val="FFFFFF"/>
-                                  <w:spacing w:val="-10"/>
-                                  <w:sz w:val="20"/>
-                                </w:rPr>
-                                <w:t>1</w:t>
-                              </w:r>
-                            </w:p>
-                          </w:txbxContent>
-                        </wps:txbx>
-                        <wps:bodyPr wrap="square" lIns="0" tIns="0" rIns="0" bIns="0" rtlCol="0">
-                          <a:noAutofit/>
-                        </wps:bodyPr>
-                      </wps:wsp>
-                    </wpg:wgp>
-                  </a:graphicData>
-                </a:graphic>
-              </wp:anchor>
-            </w:drawing>
-          </mc:Choice>
-          <mc:Fallback>
-            <w:pict>
-              <v:group w14:anchorId="4FFE81B8" id="_x0000_s1032" style="position:absolute;margin-left:-.05pt;margin-top:776.55pt;width:595pt;height:65pt;z-index:251663872;mso-wrap-distance-left:0;mso-wrap-distance-right:0;mso-position-horizontal-relative:page;mso-position-vertical-relative:page" coordsize="75565,8255" o:gfxdata="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">
-                <v:shape id="Graphic 4" o:spid="_x0000_s1033" style="position:absolute;top:1136;width:75565;height:7118;visibility:visible;mso-wrap-style:square;v-text-anchor:top" coordsize="7556500,711835" o:gfxdata="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" path="m7555992,l,,,711669r7555992,l7555992,xe" fillcolor="#22375d" stroked="f">
-                  <v:path arrowok="t"/>
-                </v:shape>
-                <v:shape id="Graphic 5" o:spid="_x0000_s1034" style="position:absolute;top:1079;width:75565;height:121;visibility:visible;mso-wrap-style:square;v-text-anchor:top" coordsize="7556500,12065" o:gfxdata="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" path="m,12064r7555992,l7555992,,,,,12064xe" fillcolor="#41709c" stroked="f">
-                  <v:path arrowok="t"/>
-                </v:shape>
-                <v:shape id="Graphic 6" o:spid="_x0000_s1035" style="position:absolute;width:75565;height:1079;visibility:visible;mso-wrap-style:square;v-text-anchor:top" coordsize="7556500,107950" o:gfxdata="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" path="m,l,107949r7555992,l7555992,,,xe" fillcolor="#f1f1f1" stroked="f">
-                  <v:path arrowok="t"/>
-                </v:shape>
-                <v:shape id="Textbox 7" o:spid="_x0000_s1036" type="#_x0000_t202" style="position:absolute;left:2575;top:5018;width:3899;height:1270;visibility:visible;mso-wrap-style:square;v-text-anchor:top" o:gfxdata="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" filled="f" stroked="f">
-                  <v:textbox inset="0,0,0,0">
-                    <w:txbxContent>
-                      <w:p>
-                        <w:pPr>
-                          <w:spacing w:line="199" w:lineRule="exact"/>
-                          <w:rPr>
-                            <w:rFonts w:ascii="Calibri" w:hAnsi="Calibri"/>
-                            <w:sz w:val="20"/>
-                          </w:rPr>
-                        </w:pPr>
-                        <w:r>
-                          <w:rPr>
-                            <w:rFonts w:ascii="Calibri" w:hAnsi="Calibri"/>
-                            <w:spacing w:val="-2"/>
-                            <w:sz w:val="20"/>
-                          </w:rPr>
-                          <w:t>Público</w:t>
-                        </w:r>
-                      </w:p>
-                    </w:txbxContent>
-                  </v:textbox>
-                </v:shape>
-                <v:shape id="Textbox 8" o:spid="_x0000_s1037" type="#_x0000_t202" style="position:absolute;left:19387;top:3159;width:36748;height:2807;visibility:visible;mso-wrap-style:square;v-text-anchor:top" o:gfxdata="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" filled="f" stroked="f">
-                  <v:textbox inset="0,0,0,0">
-                    <w:txbxContent>
-                      <w:p>
-                        <w:pPr>
-                          <w:spacing w:line="239" w:lineRule="exact"/>
-                          <w:ind w:left="4" w:right="19"/>
-                          <w:jc w:val="center"/>
-                          <w:rPr>
-                            <w:rFonts w:ascii="Calibri" w:hAnsi="Calibri"/>
-                            <w:b/>
-                            <w:sz w:val="20"/>
-                          </w:rPr>
-                        </w:pPr>
-                        <w:r>
-                          <w:rPr>
-                            <w:rFonts w:ascii="Calibri" w:hAnsi="Calibri"/>
-                            <w:color w:val="FFFFFF"/>
-                            <w:sz w:val="20"/>
-                          </w:rPr>
-                          <w:t xml:space="preserve">Rodovia </w:t>
-                        </w:r>
-                        <w:r>
-                          <w:rPr>
-                            <w:rFonts w:ascii="Calibri" w:hAnsi="Calibri"/>
-                            <w:color w:val="FFFFFF"/>
-                            <w:sz w:val="20"/>
-                          </w:rPr>
-                          <w:t>Engenheiro Ermênio de Oliveira Penteado, s/nº, Itaici, Indaiatuba - SP, 13340-600</w:t>
-                        </w:r>
-                        <w:r>
-                          <w:rPr>
-                            <w:rFonts w:ascii="Calibri" w:hAnsi="Calibri"/>
-                            <w:color w:val="FFFFFF"/>
-                            <w:sz w:val="20"/>
-                          </w:rPr>
-                          <w:t xml:space="preserve"> - Página</w:t>
-                        </w:r>
-                        <w:r>
-                          <w:rPr>
-                            <w:rFonts w:ascii="Calibri" w:hAnsi="Calibri"/>
-                            <w:color w:val="FFFFFF"/>
-                            <w:spacing w:val="-1"/>
-                            <w:sz w:val="20"/>
-                          </w:rPr>
-                          <w:t xml:space="preserve"> </w:t>
-                        </w:r>
-                        <w:r>
-                          <w:rPr>
-                            <w:rFonts w:ascii="Calibri" w:hAnsi="Calibri"/>
-                            <w:b/>
-                            <w:color w:val="FFFFFF"/>
-                            <w:sz w:val="20"/>
-                          </w:rPr>
-                          <w:t>1</w:t>
-                        </w:r>
-                        <w:r>
-                          <w:rPr>
-                            <w:rFonts w:ascii="Calibri" w:hAnsi="Calibri"/>
-                            <w:b/>
-                            <w:color w:val="FFFFFF"/>
-                            <w:spacing w:val="-3"/>
-                            <w:sz w:val="20"/>
-                          </w:rPr>
-                          <w:t xml:space="preserve"> </w:t>
-                        </w:r>
-                        <w:r>
-                          <w:rPr>
-                            <w:rFonts w:ascii="Calibri" w:hAnsi="Calibri"/>
-                            <w:color w:val="FFFFFF"/>
-                            <w:sz w:val="20"/>
-                          </w:rPr>
-                          <w:t>de</w:t>
-                        </w:r>
-                        <w:r>
-                          <w:rPr>
-                            <w:rFonts w:ascii="Calibri" w:hAnsi="Calibri"/>
-                            <w:color w:val="FFFFFF"/>
-                            <w:spacing w:val="-4"/>
-                            <w:sz w:val="20"/>
-                          </w:rPr>
-                          <w:t xml:space="preserve"> </w:t>
-                        </w:r>
-                        <w:r>
-                          <w:rPr>
-                            <w:rFonts w:ascii="Calibri" w:hAnsi="Calibri"/>
-                            <w:b/>
-                            <w:color w:val="FFFFFF"/>
-                            <w:spacing w:val="-10"/>
-                            <w:sz w:val="20"/>
-                          </w:rPr>
-                          <w:t>1</w:t>
-                        </w:r>
-                      </w:p>
-                    </w:txbxContent>
-                  </v:textbox>
-                </v:shape>
-                <w10:wrap anchorx="page" anchory="page"/>
-              </v:group>
-            </w:pict>
-          </mc:Fallback>
-        </mc:AlternateContent>
-      </w:r>
+      <w:bookmarkStart w:id="0" w:name="_GoBack"/>
+      <w:bookmarkEnd w:id="0"/>
     </w:p>
     <w:sectPr>
       <w:headerReference w:type="default" r:id="rId10"/>
+      <w:footerReference w:type="default" r:id="rId11"/>
       <w:type w:val="continuous"/>
       <w:pgSz w:w="11900" w:h="16850"/>
       <w:pgMar w:top="2127" w:right="1133" w:bottom="2269" w:left="1700" w:header="345" w:footer="0" w:gutter="0"/>
@@ -1090,6 +632,605 @@
 </w:endnotes>
 </file>
 
+<file path=word/footer1.xml><?xml version="1.0" encoding="utf-8"?>
+<w:ftr xmlns:wpc="http://schemas.microsoft.com/office/word/2010/wordprocessingCanvas" xmlns:cx="http://schemas.microsoft.com/office/drawing/2014/chartex" xmlns:cx1="http://schemas.microsoft.com/office/drawing/2015/9/8/chartex" xmlns:mc="http://schemas.openxmlformats.org/markup-compatibility/2006" xmlns:o="urn:schemas-microsoft-com:office:office" xmlns:r="http://schemas.openxmlformats.org/officeDocument/2006/relationships" xmlns:m="http://schemas.openxmlformats.org/officeDocument/2006/math" xmlns:v="urn:schemas-microsoft-com:vml" xmlns:wp14="http://schemas.microsoft.com/office/word/2010/wordprocessingDrawing" xmlns:wp="http://schemas.openxmlformats.org/drawingml/2006/wordprocessingDrawing" xmlns:w10="urn:schemas-microsoft-com:office:word" xmlns:w="http://schemas.openxmlformats.org/wordprocessingml/2006/main" xmlns:w14="http://schemas.microsoft.com/office/word/2010/wordml" xmlns:w15="http://schemas.microsoft.com/office/word/2012/wordml" xmlns:w16se="http://schemas.microsoft.com/office/word/2015/wordml/symex" xmlns:wpg="http://schemas.microsoft.com/office/word/2010/wordprocessingGroup" xmlns:wpi="http://schemas.microsoft.com/office/word/2010/wordprocessingInk" xmlns:wne="http://schemas.microsoft.com/office/word/2006/wordml" xmlns:wps="http://schemas.microsoft.com/office/word/2010/wordprocessingShape" mc:Ignorable="w14 w15 w16se wp14">
+  <w:p>
+    <w:pPr>
+      <w:pStyle w:val="Rodap"/>
+    </w:pPr>
+    <w:r>
+      <w:rPr>
+        <w:noProof/>
+        <w:lang w:val="pt-BR" w:eastAsia="pt-BR"/>
+      </w:rPr>
+      <mc:AlternateContent>
+        <mc:Choice Requires="wpg">
+          <w:drawing>
+            <wp:anchor distT="0" distB="0" distL="0" distR="0" simplePos="0" relativeHeight="251661312" behindDoc="0" locked="0" layoutInCell="1" allowOverlap="1" wp14:anchorId="7FF014F8" wp14:editId="1B60C86C">
+              <wp:simplePos x="0" y="0"/>
+              <wp:positionH relativeFrom="page">
+                <wp:posOffset>-12065</wp:posOffset>
+              </wp:positionH>
+              <wp:positionV relativeFrom="page">
+                <wp:posOffset>9847258</wp:posOffset>
+              </wp:positionV>
+              <wp:extent cx="7556500" cy="825500"/>
+              <wp:effectExtent l="0" t="0" r="6350" b="0"/>
+              <wp:wrapNone/>
+              <wp:docPr id="10" name="Group 3"/>
+              <wp:cNvGraphicFramePr>
+                <a:graphicFrameLocks xmlns:a="http://schemas.openxmlformats.org/drawingml/2006/main"/>
+              </wp:cNvGraphicFramePr>
+              <a:graphic xmlns:a="http://schemas.openxmlformats.org/drawingml/2006/main">
+                <a:graphicData uri="http://schemas.microsoft.com/office/word/2010/wordprocessingGroup">
+                  <wpg:wgp>
+                    <wpg:cNvGrpSpPr>
+                      <a:grpSpLocks/>
+                    </wpg:cNvGrpSpPr>
+                    <wpg:grpSpPr>
+                      <a:xfrm>
+                        <a:off x="0" y="0"/>
+                        <a:ext cx="7556500" cy="825500"/>
+                        <a:chOff x="0" y="0"/>
+                        <a:chExt cx="7556500" cy="825500"/>
+                      </a:xfrm>
+                    </wpg:grpSpPr>
+                    <wps:wsp>
+                      <wps:cNvPr id="11" name="Graphic 4"/>
+                      <wps:cNvSpPr/>
+                      <wps:spPr>
+                        <a:xfrm>
+                          <a:off x="0" y="113664"/>
+                          <a:ext cx="7556500" cy="711835"/>
+                        </a:xfrm>
+                        <a:custGeom>
+                          <a:avLst/>
+                          <a:gdLst/>
+                          <a:ahLst/>
+                          <a:cxnLst/>
+                          <a:rect l="l" t="t" r="r" b="b"/>
+                          <a:pathLst>
+                            <a:path w="7556500" h="711835">
+                              <a:moveTo>
+                                <a:pt x="7555992" y="0"/>
+                              </a:moveTo>
+                              <a:lnTo>
+                                <a:pt x="0" y="0"/>
+                              </a:lnTo>
+                              <a:lnTo>
+                                <a:pt x="0" y="711669"/>
+                              </a:lnTo>
+                              <a:lnTo>
+                                <a:pt x="7555992" y="711669"/>
+                              </a:lnTo>
+                              <a:lnTo>
+                                <a:pt x="7555992" y="0"/>
+                              </a:lnTo>
+                              <a:close/>
+                            </a:path>
+                          </a:pathLst>
+                        </a:custGeom>
+                        <a:solidFill>
+                          <a:srgbClr val="22375D"/>
+                        </a:solidFill>
+                      </wps:spPr>
+                      <wps:bodyPr wrap="square" lIns="0" tIns="0" rIns="0" bIns="0" rtlCol="0">
+                        <a:prstTxWarp prst="textNoShape">
+                          <a:avLst/>
+                        </a:prstTxWarp>
+                        <a:noAutofit/>
+                      </wps:bodyPr>
+                    </wps:wsp>
+                    <wps:wsp>
+                      <wps:cNvPr id="13" name="Graphic 5"/>
+                      <wps:cNvSpPr/>
+                      <wps:spPr>
+                        <a:xfrm>
+                          <a:off x="0" y="107950"/>
+                          <a:ext cx="7556500" cy="12065"/>
+                        </a:xfrm>
+                        <a:custGeom>
+                          <a:avLst/>
+                          <a:gdLst/>
+                          <a:ahLst/>
+                          <a:cxnLst/>
+                          <a:rect l="l" t="t" r="r" b="b"/>
+                          <a:pathLst>
+                            <a:path w="7556500" h="12065">
+                              <a:moveTo>
+                                <a:pt x="0" y="12064"/>
+                              </a:moveTo>
+                              <a:lnTo>
+                                <a:pt x="7555992" y="12064"/>
+                              </a:lnTo>
+                              <a:lnTo>
+                                <a:pt x="7555992" y="0"/>
+                              </a:lnTo>
+                              <a:lnTo>
+                                <a:pt x="0" y="0"/>
+                              </a:lnTo>
+                              <a:lnTo>
+                                <a:pt x="0" y="12064"/>
+                              </a:lnTo>
+                              <a:close/>
+                            </a:path>
+                          </a:pathLst>
+                        </a:custGeom>
+                        <a:solidFill>
+                          <a:srgbClr val="41709C"/>
+                        </a:solidFill>
+                      </wps:spPr>
+                      <wps:bodyPr wrap="square" lIns="0" tIns="0" rIns="0" bIns="0" rtlCol="0">
+                        <a:prstTxWarp prst="textNoShape">
+                          <a:avLst/>
+                        </a:prstTxWarp>
+                        <a:noAutofit/>
+                      </wps:bodyPr>
+                    </wps:wsp>
+                    <wps:wsp>
+                      <wps:cNvPr id="14" name="Graphic 6"/>
+                      <wps:cNvSpPr/>
+                      <wps:spPr>
+                        <a:xfrm>
+                          <a:off x="0" y="0"/>
+                          <a:ext cx="7556500" cy="107950"/>
+                        </a:xfrm>
+                        <a:custGeom>
+                          <a:avLst/>
+                          <a:gdLst/>
+                          <a:ahLst/>
+                          <a:cxnLst/>
+                          <a:rect l="l" t="t" r="r" b="b"/>
+                          <a:pathLst>
+                            <a:path w="7556500" h="107950">
+                              <a:moveTo>
+                                <a:pt x="0" y="0"/>
+                              </a:moveTo>
+                              <a:lnTo>
+                                <a:pt x="0" y="107949"/>
+                              </a:lnTo>
+                              <a:lnTo>
+                                <a:pt x="7555992" y="107949"/>
+                              </a:lnTo>
+                              <a:lnTo>
+                                <a:pt x="7555992" y="0"/>
+                              </a:lnTo>
+                              <a:lnTo>
+                                <a:pt x="0" y="0"/>
+                              </a:lnTo>
+                              <a:close/>
+                            </a:path>
+                          </a:pathLst>
+                        </a:custGeom>
+                        <a:solidFill>
+                          <a:srgbClr val="F1F1F1"/>
+                        </a:solidFill>
+                      </wps:spPr>
+                      <wps:bodyPr wrap="square" lIns="0" tIns="0" rIns="0" bIns="0" rtlCol="0">
+                        <a:prstTxWarp prst="textNoShape">
+                          <a:avLst/>
+                        </a:prstTxWarp>
+                        <a:noAutofit/>
+                      </wps:bodyPr>
+                    </wps:wsp>
+                    <wps:wsp>
+                      <wps:cNvPr id="15" name="Textbox 7"/>
+                      <wps:cNvSpPr txBox="1"/>
+                      <wps:spPr>
+                        <a:xfrm>
+                          <a:off x="257556" y="501865"/>
+                          <a:ext cx="389890" cy="127000"/>
+                        </a:xfrm>
+                        <a:prstGeom prst="rect">
+                          <a:avLst/>
+                        </a:prstGeom>
+                      </wps:spPr>
+                      <wps:txbx>
+                        <w:txbxContent>
+                          <w:p>
+                            <w:pPr>
+                              <w:spacing w:line="199" w:lineRule="exact"/>
+                              <w:rPr>
+                                <w:rFonts w:ascii="Calibri" w:hAnsi="Calibri"/>
+                                <w:sz w:val="20"/>
+                              </w:rPr>
+                            </w:pPr>
+                            <w:r>
+                              <w:rPr>
+                                <w:rFonts w:ascii="Calibri" w:hAnsi="Calibri"/>
+                                <w:spacing w:val="-2"/>
+                                <w:sz w:val="20"/>
+                              </w:rPr>
+                              <w:t>Público</w:t>
+                            </w:r>
+                          </w:p>
+                        </w:txbxContent>
+                      </wps:txbx>
+                      <wps:bodyPr wrap="square" lIns="0" tIns="0" rIns="0" bIns="0" rtlCol="0">
+                        <a:noAutofit/>
+                      </wps:bodyPr>
+                    </wps:wsp>
+                    <wps:wsp>
+                      <wps:cNvPr id="16" name="Textbox 8"/>
+                      <wps:cNvSpPr txBox="1"/>
+                      <wps:spPr>
+                        <a:xfrm>
+                          <a:off x="1938782" y="315937"/>
+                          <a:ext cx="3674745" cy="280670"/>
+                        </a:xfrm>
+                        <a:prstGeom prst="rect">
+                          <a:avLst/>
+                        </a:prstGeom>
+                      </wps:spPr>
+                      <wps:txbx>
+                        <w:txbxContent>
+                          <w:p>
+                            <w:pPr>
+                              <w:spacing w:line="239" w:lineRule="exact"/>
+                              <w:ind w:left="4" w:right="19"/>
+                              <w:jc w:val="center"/>
+                              <w:rPr>
+                                <w:rFonts w:ascii="Calibri" w:hAnsi="Calibri"/>
+                                <w:b/>
+                                <w:sz w:val="20"/>
+                              </w:rPr>
+                            </w:pPr>
+                            <w:r>
+                              <w:rPr>
+                                <w:rFonts w:ascii="Calibri" w:hAnsi="Calibri"/>
+                                <w:color w:val="FFFFFF"/>
+                                <w:sz w:val="20"/>
+                              </w:rPr>
+                              <w:t>Rod. Eng. Ermênio de Oliveira Penteado, km 56,5 - Itaici, Indaiatuba - SP, 13340-600</w:t>
+                            </w:r>
+                            <w:r>
+                              <w:rPr>
+                                <w:rFonts w:ascii="Calibri" w:hAnsi="Calibri"/>
+                                <w:color w:val="FFFFFF"/>
+                                <w:sz w:val="20"/>
+                              </w:rPr>
+                              <w:t xml:space="preserve"> – 8º Andar,  </w:t>
+                            </w:r>
+                            <w:r>
+                              <w:rPr>
+                                <w:rFonts w:ascii="Calibri" w:hAnsi="Calibri"/>
+                                <w:color w:val="FFFFFF"/>
+                                <w:sz w:val="20"/>
+                                <w:lang w:val="pt-BR"/>
+                              </w:rPr>
+                              <w:t xml:space="preserve">Página </w:t>
+                            </w:r>
+                            <w:r>
+                              <w:rPr>
+                                <w:rFonts w:ascii="Calibri" w:hAnsi="Calibri"/>
+                                <w:b/>
+                                <w:bCs/>
+                                <w:color w:val="FFFFFF"/>
+                                <w:sz w:val="20"/>
+                              </w:rPr>
+                              <w:fldChar w:fldCharType="begin"/>
+                            </w:r>
+                            <w:r>
+                              <w:rPr>
+                                <w:rFonts w:ascii="Calibri" w:hAnsi="Calibri"/>
+                                <w:b/>
+                                <w:bCs/>
+                                <w:color w:val="FFFFFF"/>
+                                <w:sz w:val="20"/>
+                              </w:rPr>
+                              <w:instrText>PAGE  \* Arabic  \* MERGEFORMAT</w:instrText>
+                            </w:r>
+                            <w:r>
+                              <w:rPr>
+                                <w:rFonts w:ascii="Calibri" w:hAnsi="Calibri"/>
+                                <w:b/>
+                                <w:bCs/>
+                                <w:color w:val="FFFFFF"/>
+                                <w:sz w:val="20"/>
+                              </w:rPr>
+                              <w:fldChar w:fldCharType="separate"/>
+                            </w:r>
+                            <w:r>
+                              <w:rPr>
+                                <w:rFonts w:ascii="Calibri" w:hAnsi="Calibri"/>
+                                <w:b/>
+                                <w:bCs/>
+                                <w:noProof/>
+                                <w:color w:val="FFFFFF"/>
+                                <w:sz w:val="20"/>
+                                <w:lang w:val="pt-BR"/>
+                              </w:rPr>
+                              <w:t>1</w:t>
+                            </w:r>
+                            <w:r>
+                              <w:rPr>
+                                <w:rFonts w:ascii="Calibri" w:hAnsi="Calibri"/>
+                                <w:b/>
+                                <w:bCs/>
+                                <w:color w:val="FFFFFF"/>
+                                <w:sz w:val="20"/>
+                              </w:rPr>
+                              <w:fldChar w:fldCharType="end"/>
+                            </w:r>
+                            <w:r>
+                              <w:rPr>
+                                <w:rFonts w:ascii="Calibri" w:hAnsi="Calibri"/>
+                                <w:color w:val="FFFFFF"/>
+                                <w:sz w:val="20"/>
+                                <w:lang w:val="pt-BR"/>
+                              </w:rPr>
+                              <w:t xml:space="preserve"> de </w:t>
+                            </w:r>
+                            <w:r>
+                              <w:rPr>
+                                <w:rFonts w:ascii="Calibri" w:hAnsi="Calibri"/>
+                                <w:b/>
+                                <w:bCs/>
+                                <w:color w:val="FFFFFF"/>
+                                <w:sz w:val="20"/>
+                              </w:rPr>
+                              <w:fldChar w:fldCharType="begin"/>
+                            </w:r>
+                            <w:r>
+                              <w:rPr>
+                                <w:rFonts w:ascii="Calibri" w:hAnsi="Calibri"/>
+                                <w:b/>
+                                <w:bCs/>
+                                <w:color w:val="FFFFFF"/>
+                                <w:sz w:val="20"/>
+                              </w:rPr>
+                              <w:instrText>NUMPAGES  \* Arabic  \* MERGEFORMAT</w:instrText>
+                            </w:r>
+                            <w:r>
+                              <w:rPr>
+                                <w:rFonts w:ascii="Calibri" w:hAnsi="Calibri"/>
+                                <w:b/>
+                                <w:bCs/>
+                                <w:color w:val="FFFFFF"/>
+                                <w:sz w:val="20"/>
+                              </w:rPr>
+                              <w:fldChar w:fldCharType="separate"/>
+                            </w:r>
+                            <w:r>
+                              <w:rPr>
+                                <w:rFonts w:ascii="Calibri" w:hAnsi="Calibri"/>
+                                <w:b/>
+                                <w:bCs/>
+                                <w:noProof/>
+                                <w:color w:val="FFFFFF"/>
+                                <w:sz w:val="20"/>
+                                <w:lang w:val="pt-BR"/>
+                              </w:rPr>
+                              <w:t>1</w:t>
+                            </w:r>
+                            <w:r>
+                              <w:rPr>
+                                <w:rFonts w:ascii="Calibri" w:hAnsi="Calibri"/>
+                                <w:b/>
+                                <w:bCs/>
+                                <w:color w:val="FFFFFF"/>
+                                <w:sz w:val="20"/>
+                              </w:rPr>
+                              <w:fldChar w:fldCharType="end"/>
+                            </w:r>
+                          </w:p>
+                        </w:txbxContent>
+                      </wps:txbx>
+                      <wps:bodyPr wrap="square" lIns="0" tIns="0" rIns="0" bIns="0" rtlCol="0">
+                        <a:noAutofit/>
+                      </wps:bodyPr>
+                    </wps:wsp>
+                  </wpg:wgp>
+                </a:graphicData>
+              </a:graphic>
+            </wp:anchor>
+          </w:drawing>
+        </mc:Choice>
+        <mc:Fallback>
+          <w:pict>
+            <v:group w14:anchorId="7FF014F8" id="Group 3" o:spid="_x0000_s1027" style="position:absolute;margin-left:-.95pt;margin-top:775.35pt;width:595pt;height:65pt;z-index:251661312;mso-wrap-distance-left:0;mso-wrap-distance-right:0;mso-position-horizontal-relative:page;mso-position-vertical-relative:page" coordsize="75565,8255" o:gfxdata="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">
+              <v:shape id="Graphic 4" o:spid="_x0000_s1028" style="position:absolute;top:1136;width:75565;height:7118;visibility:visible;mso-wrap-style:square;v-text-anchor:top" coordsize="7556500,711835" o:gfxdata="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" path="m7555992,l,,,711669r7555992,l7555992,xe" fillcolor="#22375d" stroked="f">
+                <v:path arrowok="t"/>
+              </v:shape>
+              <v:shape id="Graphic 5" o:spid="_x0000_s1029" style="position:absolute;top:1079;width:75565;height:121;visibility:visible;mso-wrap-style:square;v-text-anchor:top" coordsize="7556500,12065" o:gfxdata="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" path="m,12064r7555992,l7555992,,,,,12064xe" fillcolor="#41709c" stroked="f">
+                <v:path arrowok="t"/>
+              </v:shape>
+              <v:shape id="Graphic 6" o:spid="_x0000_s1030" style="position:absolute;width:75565;height:1079;visibility:visible;mso-wrap-style:square;v-text-anchor:top" coordsize="7556500,107950" o:gfxdata="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" path="m,l,107949r7555992,l7555992,,,xe" fillcolor="#f1f1f1" stroked="f">
+                <v:path arrowok="t"/>
+              </v:shape>
+              <v:shapetype id="_x0000_t202" coordsize="21600,21600" o:spt="202" path="m,l,21600r21600,l21600,xe">
+                <v:stroke joinstyle="miter"/>
+                <v:path gradientshapeok="t" o:connecttype="rect"/>
+              </v:shapetype>
+              <v:shape id="Textbox 7" o:spid="_x0000_s1031" type="#_x0000_t202" style="position:absolute;left:2575;top:5018;width:3899;height:1270;visibility:visible;mso-wrap-style:square;v-text-anchor:top" o:gfxdata="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" filled="f" stroked="f">
+                <v:textbox inset="0,0,0,0">
+                  <w:txbxContent>
+                    <w:p>
+                      <w:pPr>
+                        <w:spacing w:line="199" w:lineRule="exact"/>
+                        <w:rPr>
+                          <w:rFonts w:ascii="Calibri" w:hAnsi="Calibri"/>
+                          <w:sz w:val="20"/>
+                        </w:rPr>
+                      </w:pPr>
+                      <w:r>
+                        <w:rPr>
+                          <w:rFonts w:ascii="Calibri" w:hAnsi="Calibri"/>
+                          <w:spacing w:val="-2"/>
+                          <w:sz w:val="20"/>
+                        </w:rPr>
+                        <w:t>Público</w:t>
+                      </w:r>
+                    </w:p>
+                  </w:txbxContent>
+                </v:textbox>
+              </v:shape>
+              <v:shape id="Textbox 8" o:spid="_x0000_s1032" type="#_x0000_t202" style="position:absolute;left:19387;top:3159;width:36748;height:2807;visibility:visible;mso-wrap-style:square;v-text-anchor:top" o:gfxdata="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" filled="f" stroked="f">
+                <v:textbox inset="0,0,0,0">
+                  <w:txbxContent>
+                    <w:p>
+                      <w:pPr>
+                        <w:spacing w:line="239" w:lineRule="exact"/>
+                        <w:ind w:left="4" w:right="19"/>
+                        <w:jc w:val="center"/>
+                        <w:rPr>
+                          <w:rFonts w:ascii="Calibri" w:hAnsi="Calibri"/>
+                          <w:b/>
+                          <w:sz w:val="20"/>
+                        </w:rPr>
+                      </w:pPr>
+                      <w:r>
+                        <w:rPr>
+                          <w:rFonts w:ascii="Calibri" w:hAnsi="Calibri"/>
+                          <w:color w:val="FFFFFF"/>
+                          <w:sz w:val="20"/>
+                        </w:rPr>
+                        <w:t>Rod. Eng. Ermênio de Oliveira Penteado, km 56,5 - Itaici, Indaiatuba - SP, 13340-600</w:t>
+                      </w:r>
+                      <w:r>
+                        <w:rPr>
+                          <w:rFonts w:ascii="Calibri" w:hAnsi="Calibri"/>
+                          <w:color w:val="FFFFFF"/>
+                          <w:sz w:val="20"/>
+                        </w:rPr>
+                        <w:t xml:space="preserve"> – 8º Andar,  </w:t>
+                      </w:r>
+                      <w:r>
+                        <w:rPr>
+                          <w:rFonts w:ascii="Calibri" w:hAnsi="Calibri"/>
+                          <w:color w:val="FFFFFF"/>
+                          <w:sz w:val="20"/>
+                          <w:lang w:val="pt-BR"/>
+                        </w:rPr>
+                        <w:t xml:space="preserve">Página </w:t>
+                      </w:r>
+                      <w:r>
+                        <w:rPr>
+                          <w:rFonts w:ascii="Calibri" w:hAnsi="Calibri"/>
+                          <w:b/>
+                          <w:bCs/>
+                          <w:color w:val="FFFFFF"/>
+                          <w:sz w:val="20"/>
+                        </w:rPr>
+                        <w:fldChar w:fldCharType="begin"/>
+                      </w:r>
+                      <w:r>
+                        <w:rPr>
+                          <w:rFonts w:ascii="Calibri" w:hAnsi="Calibri"/>
+                          <w:b/>
+                          <w:bCs/>
+                          <w:color w:val="FFFFFF"/>
+                          <w:sz w:val="20"/>
+                        </w:rPr>
+                        <w:instrText>PAGE  \* Arabic  \* MERGEFORMAT</w:instrText>
+                      </w:r>
+                      <w:r>
+                        <w:rPr>
+                          <w:rFonts w:ascii="Calibri" w:hAnsi="Calibri"/>
+                          <w:b/>
+                          <w:bCs/>
+                          <w:color w:val="FFFFFF"/>
+                          <w:sz w:val="20"/>
+                        </w:rPr>
+                        <w:fldChar w:fldCharType="separate"/>
+                      </w:r>
+                      <w:r>
+                        <w:rPr>
+                          <w:rFonts w:ascii="Calibri" w:hAnsi="Calibri"/>
+                          <w:b/>
+                          <w:bCs/>
+                          <w:noProof/>
+                          <w:color w:val="FFFFFF"/>
+                          <w:sz w:val="20"/>
+                          <w:lang w:val="pt-BR"/>
+                        </w:rPr>
+                        <w:t>1</w:t>
+                      </w:r>
+                      <w:r>
+                        <w:rPr>
+                          <w:rFonts w:ascii="Calibri" w:hAnsi="Calibri"/>
+                          <w:b/>
+                          <w:bCs/>
+                          <w:color w:val="FFFFFF"/>
+                          <w:sz w:val="20"/>
+                        </w:rPr>
+                        <w:fldChar w:fldCharType="end"/>
+                      </w:r>
+                      <w:r>
+                        <w:rPr>
+                          <w:rFonts w:ascii="Calibri" w:hAnsi="Calibri"/>
+                          <w:color w:val="FFFFFF"/>
+                          <w:sz w:val="20"/>
+                          <w:lang w:val="pt-BR"/>
+                        </w:rPr>
+                        <w:t xml:space="preserve"> de </w:t>
+                      </w:r>
+                      <w:r>
+                        <w:rPr>
+                          <w:rFonts w:ascii="Calibri" w:hAnsi="Calibri"/>
+                          <w:b/>
+                          <w:bCs/>
+                          <w:color w:val="FFFFFF"/>
+                          <w:sz w:val="20"/>
+                        </w:rPr>
+                        <w:fldChar w:fldCharType="begin"/>
+                      </w:r>
+                      <w:r>
+                        <w:rPr>
+                          <w:rFonts w:ascii="Calibri" w:hAnsi="Calibri"/>
+                          <w:b/>
+                          <w:bCs/>
+                          <w:color w:val="FFFFFF"/>
+                          <w:sz w:val="20"/>
+                        </w:rPr>
+                        <w:instrText>NUMPAGES  \* Arabic  \* MERGEFORMAT</w:instrText>
+                      </w:r>
+                      <w:r>
+                        <w:rPr>
+                          <w:rFonts w:ascii="Calibri" w:hAnsi="Calibri"/>
+                          <w:b/>
+                          <w:bCs/>
+                          <w:color w:val="FFFFFF"/>
+                          <w:sz w:val="20"/>
+                        </w:rPr>
+                        <w:fldChar w:fldCharType="separate"/>
+                      </w:r>
+                      <w:r>
+                        <w:rPr>
+                          <w:rFonts w:ascii="Calibri" w:hAnsi="Calibri"/>
+                          <w:b/>
+                          <w:bCs/>
+                          <w:noProof/>
+                          <w:color w:val="FFFFFF"/>
+                          <w:sz w:val="20"/>
+                          <w:lang w:val="pt-BR"/>
+                        </w:rPr>
+                        <w:t>1</w:t>
+                      </w:r>
+                      <w:r>
+                        <w:rPr>
+                          <w:rFonts w:ascii="Calibri" w:hAnsi="Calibri"/>
+                          <w:b/>
+                          <w:bCs/>
+                          <w:color w:val="FFFFFF"/>
+                          <w:sz w:val="20"/>
+                        </w:rPr>
+                        <w:fldChar w:fldCharType="end"/>
+                      </w:r>
+                    </w:p>
+                  </w:txbxContent>
+                </v:textbox>
+              </v:shape>
+              <w10:wrap anchorx="page" anchory="page"/>
+            </v:group>
+          </w:pict>
+        </mc:Fallback>
+      </mc:AlternateContent>
+    </w:r>
+  </w:p>
+</w:ftr>
+</file>
+
 <file path=word/footnotes.xml><?xml version="1.0" encoding="utf-8"?>
 <w:footnotes xmlns:wpc="http://schemas.microsoft.com/office/word/2010/wordprocessingCanvas" xmlns:cx="http://schemas.microsoft.com/office/drawing/2014/chartex" xmlns:cx1="http://schemas.microsoft.com/office/drawing/2015/9/8/chartex" xmlns:mc="http://schemas.openxmlformats.org/markup-compatibility/2006" xmlns:o="urn:schemas-microsoft-com:office:office" xmlns:r="http://schemas.openxmlformats.org/officeDocument/2006/relationships" xmlns:m="http://schemas.openxmlformats.org/officeDocument/2006/math" xmlns:v="urn:schemas-microsoft-com:vml" xmlns:wp14="http://schemas.microsoft.com/office/word/2010/wordprocessingDrawing" xmlns:wp="http://schemas.openxmlformats.org/drawingml/2006/wordprocessingDrawing" xmlns:w10="urn:schemas-microsoft-com:office:word" xmlns:w="http://schemas.openxmlformats.org/wordprocessingml/2006/main" xmlns:w14="http://schemas.microsoft.com/office/word/2010/wordml" xmlns:w15="http://schemas.microsoft.com/office/word/2012/wordml" xmlns:w16se="http://schemas.microsoft.com/office/word/2015/wordml/symex" xmlns:wpg="http://schemas.microsoft.com/office/word/2010/wordprocessingGroup" xmlns:wpi="http://schemas.microsoft.com/office/word/2010/wordprocessingInk" xmlns:wne="http://schemas.microsoft.com/office/word/2006/wordml" xmlns:wps="http://schemas.microsoft.com/office/word/2010/wordprocessingShape" mc:Ignorable="w14 w15 w16se wp14">
   <w:footnote w:type="separator" w:id="-1">
@@ -1119,6 +1260,62 @@
         <w:sz w:val="20"/>
       </w:rPr>
     </w:pPr>
+    <w:r>
+      <w:rPr>
+        <w:b/>
+        <w:noProof/>
+        <w:lang w:val="pt-BR" w:eastAsia="pt-BR"/>
+      </w:rPr>
+      <w:drawing>
+        <wp:anchor distT="0" distB="0" distL="0" distR="0" simplePos="0" relativeHeight="251663360" behindDoc="1" locked="0" layoutInCell="1" allowOverlap="1" wp14:anchorId="12C1C7EB" wp14:editId="29C939C3">
+          <wp:simplePos x="0" y="0"/>
+          <wp:positionH relativeFrom="margin">
+            <wp:posOffset>0</wp:posOffset>
+          </wp:positionH>
+          <wp:positionV relativeFrom="page">
+            <wp:posOffset>2606798</wp:posOffset>
+          </wp:positionV>
+          <wp:extent cx="5612400" cy="5392800"/>
+          <wp:effectExtent l="0" t="0" r="7620" b="0"/>
+          <wp:wrapNone/>
+          <wp:docPr id="9" name="Image 9"/>
+          <wp:cNvGraphicFramePr>
+            <a:graphicFrameLocks xmlns:a="http://schemas.openxmlformats.org/drawingml/2006/main"/>
+          </wp:cNvGraphicFramePr>
+          <a:graphic xmlns:a="http://schemas.openxmlformats.org/drawingml/2006/main">
+            <a:graphicData uri="http://schemas.openxmlformats.org/drawingml/2006/picture">
+              <pic:pic xmlns:pic="http://schemas.openxmlformats.org/drawingml/2006/picture">
+                <pic:nvPicPr>
+                  <pic:cNvPr id="9" name="Image 9"/>
+                  <pic:cNvPicPr/>
+                </pic:nvPicPr>
+                <pic:blipFill>
+                  <a:blip r:embed="rId1" cstate="print"/>
+                  <a:stretch>
+                    <a:fillRect/>
+                  </a:stretch>
+                </pic:blipFill>
+                <pic:spPr>
+                  <a:xfrm>
+                    <a:off x="0" y="0"/>
+                    <a:ext cx="5612400" cy="5392800"/>
+                  </a:xfrm>
+                  <a:prstGeom prst="rect">
+                    <a:avLst/>
+                  </a:prstGeom>
+                </pic:spPr>
+              </pic:pic>
+            </a:graphicData>
+          </a:graphic>
+          <wp14:sizeRelH relativeFrom="margin">
+            <wp14:pctWidth>0</wp14:pctWidth>
+          </wp14:sizeRelH>
+          <wp14:sizeRelV relativeFrom="margin">
+            <wp14:pctHeight>0</wp14:pctHeight>
+          </wp14:sizeRelV>
+        </wp:anchor>
+      </w:drawing>
+    </w:r>
     <w:r>
       <w:rPr>
         <w:noProof/>
@@ -1149,7 +1346,7 @@
                   <pic:cNvPicPr/>
                 </pic:nvPicPr>
                 <pic:blipFill>
-                  <a:blip r:embed="rId1" cstate="print"/>
+                  <a:blip r:embed="rId2" cstate="print"/>
                   <a:stretch>
                     <a:fillRect/>
                   </a:stretch>
@@ -2614,23 +2811,6 @@
 </file>
 
 <file path=customXml/item1.xml><?xml version="1.0" encoding="utf-8"?>
-<?mso-contentType ?>
-<FormTemplates xmlns="http://schemas.microsoft.com/sharepoint/v3/contenttype/forms">
-  <Display>DocumentLibraryForm</Display>
-  <Edit>DocumentLibraryForm</Edit>
-  <New>DocumentLibraryForm</New>
-</FormTemplates>
-</file>
-
-<file path=customXml/item2.xml><?xml version="1.0" encoding="utf-8"?>
-<p:properties xmlns:p="http://schemas.microsoft.com/office/2006/metadata/properties" xmlns:xsi="http://www.w3.org/2001/XMLSchema-instance" xmlns:pc="http://schemas.microsoft.com/office/infopath/2007/PartnerControls">
-  <documentManagement>
-    <_activity xmlns="8cc46b08-5e5a-4d62-8f1c-cc78ea09a8de" xsi:nil="true"/>
-  </documentManagement>
-</p:properties>
-</file>
-
-<file path=customXml/item3.xml><?xml version="1.0" encoding="utf-8"?>
 <ct:contentTypeSchema xmlns:ct="http://schemas.microsoft.com/office/2006/metadata/contentType" xmlns:ma="http://schemas.microsoft.com/office/2006/metadata/properties/metaAttributes" ct:_="" ma:_="" ma:contentTypeName="Documento" ma:contentTypeID="0x0101003C3D7B427935F84FA2A866248849A007" ma:contentTypeVersion="10" ma:contentTypeDescription="Crie um novo documento." ma:contentTypeScope="" ma:versionID="0931b8b7f87a1624dd5bcf5b5c1080d9">
   <xsd:schema xmlns:xsd="http://www.w3.org/2001/XMLSchema" xmlns:xs="http://www.w3.org/2001/XMLSchema" xmlns:p="http://schemas.microsoft.com/office/2006/metadata/properties" xmlns:ns3="8cc46b08-5e5a-4d62-8f1c-cc78ea09a8de" targetNamespace="http://schemas.microsoft.com/office/2006/metadata/properties" ma:root="true" ma:fieldsID="e3b92d1bf976bbd8c878871d1b836332" ns3:_="">
     <xsd:import namespace="8cc46b08-5e5a-4d62-8f1c-cc78ea09a8de"/>
@@ -2812,31 +2992,24 @@
 </ct:contentTypeSchema>
 </file>
 
-<file path=customXml/itemProps1.xml><?xml version="1.0" encoding="utf-8"?>
-<ds:datastoreItem xmlns:ds="http://schemas.openxmlformats.org/officeDocument/2006/customXml" ds:itemID="{23566B03-0D06-4858-B01F-58EC5A841A86}">
-  <ds:schemaRefs>
-    <ds:schemaRef ds:uri="http://schemas.microsoft.com/sharepoint/v3/contenttype/forms"/>
-  </ds:schemaRefs>
-</ds:datastoreItem>
+<file path=customXml/item2.xml><?xml version="1.0" encoding="utf-8"?>
+<p:properties xmlns:p="http://schemas.microsoft.com/office/2006/metadata/properties" xmlns:xsi="http://www.w3.org/2001/XMLSchema-instance" xmlns:pc="http://schemas.microsoft.com/office/infopath/2007/PartnerControls">
+  <documentManagement>
+    <_activity xmlns="8cc46b08-5e5a-4d62-8f1c-cc78ea09a8de" xsi:nil="true"/>
+  </documentManagement>
+</p:properties>
 </file>
 
-<file path=customXml/itemProps2.xml><?xml version="1.0" encoding="utf-8"?>
-<ds:datastoreItem xmlns:ds="http://schemas.openxmlformats.org/officeDocument/2006/customXml" ds:itemID="{D883760A-0274-4021-948B-CAA37992FF93}">
-  <ds:schemaRefs>
-    <ds:schemaRef ds:uri="http://purl.org/dc/elements/1.1/"/>
-    <ds:schemaRef ds:uri="http://www.w3.org/XML/1998/namespace"/>
-    <ds:schemaRef ds:uri="http://purl.org/dc/terms/"/>
-    <ds:schemaRef ds:uri="http://schemas.openxmlformats.org/package/2006/metadata/core-properties"/>
-    <ds:schemaRef ds:uri="http://purl.org/dc/dcmitype/"/>
-    <ds:schemaRef ds:uri="http://schemas.microsoft.com/office/2006/metadata/properties"/>
-    <ds:schemaRef ds:uri="http://schemas.microsoft.com/office/2006/documentManagement/types"/>
-    <ds:schemaRef ds:uri="http://schemas.microsoft.com/office/infopath/2007/PartnerControls"/>
-    <ds:schemaRef ds:uri="8cc46b08-5e5a-4d62-8f1c-cc78ea09a8de"/>
-  </ds:schemaRefs>
-</ds:datastoreItem>
+<file path=customXml/item3.xml><?xml version="1.0" encoding="utf-8"?>
+<?mso-contentType ?>
+<FormTemplates xmlns="http://schemas.microsoft.com/sharepoint/v3/contenttype/forms">
+  <Display>DocumentLibraryForm</Display>
+  <Edit>DocumentLibraryForm</Edit>
+  <New>DocumentLibraryForm</New>
+</FormTemplates>
 </file>
 
-<file path=customXml/itemProps3.xml><?xml version="1.0" encoding="utf-8"?>
+<file path=customXml/itemProps1.xml><?xml version="1.0" encoding="utf-8"?>
 <ds:datastoreItem xmlns:ds="http://schemas.openxmlformats.org/officeDocument/2006/customXml" ds:itemID="{25F8E9EA-F2C4-4252-B9CF-15180AC9F7E9}">
   <ds:schemaRefs>
     <ds:schemaRef ds:uri="http://schemas.microsoft.com/office/2006/metadata/contentType"/>
@@ -2852,4 +3025,28 @@
     <ds:schemaRef ds:uri="http://schemas.microsoft.com/internal/obd"/>
   </ds:schemaRefs>
 </ds:datastoreItem>
+</file>
+
+<file path=customXml/itemProps2.xml><?xml version="1.0" encoding="utf-8"?>
+<ds:datastoreItem xmlns:ds="http://schemas.openxmlformats.org/officeDocument/2006/customXml" ds:itemID="{D883760A-0274-4021-948B-CAA37992FF93}">
+  <ds:schemaRefs>
+    <ds:schemaRef ds:uri="http://schemas.microsoft.com/office/2006/metadata/properties"/>
+    <ds:schemaRef ds:uri="http://schemas.microsoft.com/office/2006/documentManagement/types"/>
+    <ds:schemaRef ds:uri="http://purl.org/dc/terms/"/>
+    <ds:schemaRef ds:uri="http://www.w3.org/XML/1998/namespace"/>
+    <ds:schemaRef ds:uri="http://purl.org/dc/dcmitype/"/>
+    <ds:schemaRef ds:uri="http://purl.org/dc/elements/1.1/"/>
+    <ds:schemaRef ds:uri="http://schemas.microsoft.com/office/infopath/2007/PartnerControls"/>
+    <ds:schemaRef ds:uri="http://schemas.openxmlformats.org/package/2006/metadata/core-properties"/>
+    <ds:schemaRef ds:uri="8cc46b08-5e5a-4d62-8f1c-cc78ea09a8de"/>
+  </ds:schemaRefs>
+</ds:datastoreItem>
+</file>
+
+<file path=customXml/itemProps3.xml><?xml version="1.0" encoding="utf-8"?>
+<ds:datastoreItem xmlns:ds="http://schemas.openxmlformats.org/officeDocument/2006/customXml" ds:itemID="{23566B03-0D06-4858-B01F-58EC5A841A86}">
+  <ds:schemaRefs>
+    <ds:schemaRef ds:uri="http://schemas.microsoft.com/sharepoint/v3/contenttype/forms"/>
+  </ds:schemaRefs>
+</ds:datastoreItem>
 </file>
</xml_diff>